<commit_message>
test(s5-t02): cover formatting providers through runtime execution
</commit_message>
<xml_diff>
--- a/backend/tests/fixtures/docx/generated/auto-format-provider-mixed.docx
+++ b/backend/tests/fixtures/docx/generated/auto-format-provider-mixed.docx
@@ -24,7 +24,7 @@
         </w:rPr>
         <w:t>penting</w:t>
       </w:r>
-      <w:hyperlink xmlns:r="http://schemas.openxmlformats.org/officeDocument/2006/relationships" r:id="Rc232901c19944e17">
+      <w:hyperlink xmlns:r="http://schemas.openxmlformats.org/officeDocument/2006/relationships" r:id="R2ee0638602ab449e">
         <w:r>
           <w:rPr>
             <w:rFonts w:ascii="Calibri" w:hAnsi="Calibri"/>
@@ -50,6 +50,31 @@
         <w:fldChar w:fldCharType="end"/>
       </w:r>
     </w:p>
+    <w:p>
+      <w:pPr>
+        <w:pStyle w:val="Heading1"/>
+      </w:pPr>
+      <w:r>
+        <w:t>ABSTRAK</w:t>
+      </w:r>
+    </w:p>
+    <w:p>
+      <w:pPr>
+        <w:spacing w:before="120" w:after="80" w:line="276" w:lineRule="auto"/>
+      </w:pPr>
+      <w:r>
+        <w:t>Isi abstrak sintetis untuk pengujian format otomatis.</w:t>
+      </w:r>
+    </w:p>
+    <w:p>
+      <w:pPr>
+        <w:pStyle w:val="Heading1"/>
+        <w:jc w:val="left"/>
+      </w:pPr>
+      <w:r>
+        <w:t>BAB I PENDAHULUAN</w:t>
+      </w:r>
+    </w:p>
     <w:sectPr>
       <w:pgSz w:w="11906" w:h="16838"/>
       <w:pgMar w:top="1701" w:right="1701" w:bottom="1701" w:left="2268" w:header="720" w:footer="720" w:gutter="0"/>

</xml_diff>